<commit_message>
Made a few small tweaks
</commit_message>
<xml_diff>
--- a/Software Engineer Resume.docx
+++ b/Software Engineer Resume.docx
@@ -234,7 +234,7 @@
         <w:t>‑</w:t>
       </w:r>
       <w:r>
-        <w:t>driven processing, Kafka (familiar), Flink (familiar), logs, metrics, tracing, RCA, incident response, production support</w:t>
+        <w:t>driven processing, Kafka (familiar), Flink, logs, metrics, tracing, RCA, incident response, production support</w:t>
       </w:r>
     </w:p>
     <w:p>
@@ -291,7 +291,7 @@
         <w:t>:</w:t>
       </w:r>
       <w:r>
-        <w:t xml:space="preserve"> MySQL, Oracle, Postgres, Redis, MongoDB (familiar), data modeling, performance tuning</w:t>
+        <w:t xml:space="preserve"> MySQL, Oracle, Postgres, Redis, MongoDB, data modeling, performance tuning</w:t>
       </w:r>
     </w:p>
     <w:p>
@@ -318,7 +318,7 @@
         <w:t>:</w:t>
       </w:r>
       <w:r>
-        <w:t xml:space="preserve"> OCI, AWS (familiar), Terraform, CI/CD pipelines, Chef, Ansible, Linux, Docker (familiar), Jenkins (familiar)</w:t>
+        <w:t xml:space="preserve"> OCI, AWS (familiar), Terraform, CI/CD pipelines, Chef, Ansible, Linux, Docker (familiar), Jenkins</w:t>
       </w:r>
     </w:p>
     <w:p>

</xml_diff>